<commit_message>
checkpoint: sync submitted spec mirror and origin guidance
</commit_message>
<xml_diff>
--- a/korvin-merrow-final-submission-staging/01_spec-document/Alexander_World_Merrow_latest_6_4.docx
+++ b/korvin-merrow-final-submission-staging/01_spec-document/Alexander_World_Merrow_latest_6_4.docx
@@ -9646,7 +9646,7 @@
                 <w:b w:val="0"/>
                 <w:sz w:val="16"/>
               </w:rPr>
-              <w:t>Writer-produced file; source role: ED triage nursing</w:t>
+              <w:t>Custom Made; source role: ED triage nursing</w:t>
             </w:r>
           </w:p>
         </w:tc>
@@ -9777,7 +9777,7 @@
                 <w:b w:val="0"/>
                 <w:sz w:val="16"/>
               </w:rPr>
-              <w:t>Writer-produced file; source role: Emergency Medicine provider</w:t>
+              <w:t>Custom Made; source role: Emergency Medicine provider</w:t>
             </w:r>
           </w:p>
         </w:tc>
@@ -9916,7 +9916,7 @@
                 <w:b w:val="0"/>
                 <w:sz w:val="16"/>
               </w:rPr>
-              <w:t>Writer-produced file; source role: Hospitalist service</w:t>
+              <w:t>Custom Made; source role: Hospitalist service</w:t>
             </w:r>
           </w:p>
         </w:tc>
@@ -10055,7 +10055,7 @@
                 <w:b w:val="0"/>
                 <w:sz w:val="16"/>
               </w:rPr>
-              <w:t>Writer-produced file; source role: Pharmacy med rec with patient/family collateral</w:t>
+              <w:t>Custom Made; source role: Pharmacy med rec with patient/family collateral</w:t>
             </w:r>
           </w:p>
         </w:tc>
@@ -10194,7 +10194,7 @@
                 <w:b w:val="0"/>
                 <w:sz w:val="16"/>
               </w:rPr>
-              <w:t>Writer-produced file; source role: Pharmacy history</w:t>
+              <w:t>Custom Made; source role: Pharmacy history</w:t>
             </w:r>
           </w:p>
         </w:tc>
@@ -10325,7 +10325,7 @@
                 <w:b w:val="0"/>
                 <w:sz w:val="16"/>
               </w:rPr>
-              <w:t>Writer-produced file; source role: Outpatient rheumatology</w:t>
+              <w:t>Custom Made; source role: Outpatient rheumatology</w:t>
             </w:r>
           </w:p>
         </w:tc>
@@ -10464,7 +10464,7 @@
                 <w:b w:val="0"/>
                 <w:sz w:val="16"/>
               </w:rPr>
-              <w:t>Writer-produced file; source role: Primary care documentation</w:t>
+              <w:t>Custom Made; source role: Primary care documentation</w:t>
             </w:r>
           </w:p>
         </w:tc>
@@ -10595,7 +10595,7 @@
                 <w:b w:val="0"/>
                 <w:sz w:val="16"/>
               </w:rPr>
-              <w:t>Writer-produced file; source role: Hospitalist service</w:t>
+              <w:t>Custom Made; source role: Hospitalist service</w:t>
             </w:r>
           </w:p>
         </w:tc>
@@ -10726,7 +10726,7 @@
                 <w:b w:val="0"/>
                 <w:sz w:val="16"/>
               </w:rPr>
-              <w:t>Writer-produced file; source role: Hospitalist service</w:t>
+              <w:t>Custom Made; source role: Hospitalist service</w:t>
             </w:r>
           </w:p>
         </w:tc>
@@ -10857,7 +10857,7 @@
                 <w:b w:val="0"/>
                 <w:sz w:val="16"/>
               </w:rPr>
-              <w:t>Writer-produced file; source role: Hospitalist service</w:t>
+              <w:t>Custom Made; source role: Hospitalist service</w:t>
             </w:r>
           </w:p>
         </w:tc>
@@ -10988,7 +10988,7 @@
                 <w:b w:val="0"/>
                 <w:sz w:val="16"/>
               </w:rPr>
-              <w:t>Writer-produced file; source role: Hospitalist service</w:t>
+              <w:t>Custom Made; source role: Hospitalist service</w:t>
             </w:r>
           </w:p>
         </w:tc>
@@ -11119,7 +11119,7 @@
                 <w:b w:val="0"/>
                 <w:sz w:val="16"/>
               </w:rPr>
-              <w:t>Writer-produced data source; source role: laboratory/vital trends</w:t>
+              <w:t>Custom Made; source role: laboratory/vital trends</w:t>
             </w:r>
           </w:p>
         </w:tc>
@@ -11266,7 +11266,7 @@
                 <w:b w:val="0"/>
                 <w:sz w:val="16"/>
               </w:rPr>
-              <w:t>Writer-produced data source; source role: MAR / inpatient medication actions</w:t>
+              <w:t>Custom Made; source role: MAR / inpatient medication actions</w:t>
             </w:r>
           </w:p>
         </w:tc>
@@ -11405,7 +11405,7 @@
                 <w:b w:val="0"/>
                 <w:sz w:val="16"/>
               </w:rPr>
-              <w:t>Writer-produced file; source role: Nephrology</w:t>
+              <w:t>Custom Made; source role: Nephrology</w:t>
             </w:r>
           </w:p>
         </w:tc>
@@ -11552,7 +11552,7 @@
                 <w:b w:val="0"/>
                 <w:sz w:val="16"/>
               </w:rPr>
-              <w:t>Writer-produced file; source role: Cardiology</w:t>
+              <w:t>Custom Made; source role: Cardiology</w:t>
             </w:r>
           </w:p>
         </w:tc>
@@ -11699,7 +11699,7 @@
                 <w:b w:val="0"/>
                 <w:sz w:val="16"/>
               </w:rPr>
-              <w:t>Writer-produced file; source role: Endocrinology</w:t>
+              <w:t>Custom Made; source role: Endocrinology</w:t>
             </w:r>
           </w:p>
         </w:tc>
@@ -11846,7 +11846,7 @@
                 <w:b w:val="0"/>
                 <w:sz w:val="16"/>
               </w:rPr>
-              <w:t>Writer-produced file; source role: Bedside nursing</w:t>
+              <w:t>Custom Made; source role: Bedside nursing</w:t>
             </w:r>
           </w:p>
         </w:tc>
@@ -11985,7 +11985,7 @@
                 <w:b w:val="0"/>
                 <w:sz w:val="16"/>
               </w:rPr>
-              <w:t>Writer-produced file; source role: Physical Therapy</w:t>
+              <w:t>Custom Made; source role: Physical Therapy</w:t>
             </w:r>
           </w:p>
         </w:tc>
@@ -12124,7 +12124,7 @@
                 <w:b w:val="0"/>
                 <w:sz w:val="16"/>
               </w:rPr>
-              <w:t>Writer-produced file; source role: Occupational Therapy</w:t>
+              <w:t>Custom Made; source role: Occupational Therapy</w:t>
             </w:r>
           </w:p>
         </w:tc>
@@ -12263,7 +12263,7 @@
                 <w:b w:val="0"/>
                 <w:sz w:val="16"/>
               </w:rPr>
-              <w:t>Writer-produced file; source role: documented Mara Merrow report</w:t>
+              <w:t>Custom Made; source role: documented Mara Merrow report</w:t>
             </w:r>
           </w:p>
         </w:tc>
@@ -12402,7 +12402,7 @@
                 <w:b w:val="0"/>
                 <w:sz w:val="16"/>
               </w:rPr>
-              <w:t>Writer-produced file; source role: Case Management / Social Work</w:t>
+              <w:t>Custom Made; source role: Case Management / Social Work</w:t>
             </w:r>
           </w:p>
         </w:tc>
@@ -12549,7 +12549,7 @@
                 <w:b w:val="0"/>
                 <w:sz w:val="16"/>
               </w:rPr>
-              <w:t>Writer-produced file; source role: Hospitalist / interdisciplinary planning</w:t>
+              <w:t>Custom Made; source role: Hospitalist / interdisciplinary planning</w:t>
             </w:r>
           </w:p>
         </w:tc>
@@ -12879,7 +12879,7 @@
                 <w:b w:val="0"/>
                 <w:sz w:val="16"/>
               </w:rPr>
-              <w:t>Writer-produced task context; requester: hospitalist/pharmacy/discharge clinician</w:t>
+              <w:t>Custom Made; task context; requester: hospitalist/pharmacy/discharge clinician</w:t>
             </w:r>
           </w:p>
         </w:tc>
@@ -13010,7 +13010,7 @@
                 <w:b w:val="0"/>
                 <w:sz w:val="16"/>
               </w:rPr>
-              <w:t>Writer-produced task context; requester: attending hospitalist</w:t>
+              <w:t>Custom Made; task context; requester: attending hospitalist</w:t>
             </w:r>
           </w:p>
         </w:tc>
@@ -13141,7 +13141,7 @@
                 <w:b w:val="0"/>
                 <w:sz w:val="16"/>
               </w:rPr>
-              <w:t>Writer-produced task context; requester: hospital team/case management</w:t>
+              <w:t>Custom Made; task context; requester: hospital team/case management</w:t>
             </w:r>
           </w:p>
         </w:tc>
@@ -13272,7 +13272,7 @@
                 <w:b w:val="0"/>
                 <w:sz w:val="16"/>
               </w:rPr>
-              <w:t>Writer-produced task context; requester: hospitalist-led interdisciplinary team</w:t>
+              <w:t>Custom Made; task context; requester: hospitalist-led interdisciplinary team</w:t>
             </w:r>
           </w:p>
         </w:tc>
@@ -13403,7 +13403,7 @@
                 <w:b w:val="0"/>
                 <w:sz w:val="16"/>
               </w:rPr>
-              <w:t>Writer-produced task context; requester: primary care or transition team</w:t>
+              <w:t>Custom Made; task context; requester: primary care or transition team</w:t>
             </w:r>
           </w:p>
         </w:tc>
@@ -13534,7 +13534,7 @@
                 <w:b w:val="0"/>
                 <w:sz w:val="16"/>
               </w:rPr>
-              <w:t>Writer-produced task context; requester: quality/safety/transition team</w:t>
+              <w:t>Custom Made; task context; requester: quality/safety/transition team</w:t>
             </w:r>
           </w:p>
         </w:tc>
@@ -13665,7 +13665,7 @@
                 <w:b w:val="0"/>
                 <w:sz w:val="16"/>
               </w:rPr>
-              <w:t>Writer-produced task context addendum; source role: pharmacy/discharge team</w:t>
+              <w:t>Custom Made; task context addendum; source role: pharmacy/discharge team</w:t>
             </w:r>
           </w:p>
         </w:tc>
@@ -13987,7 +13987,7 @@
                 <w:b w:val="0"/>
                 <w:sz w:val="16"/>
               </w:rPr>
-              <w:t>Writer-produced supplementary provenance; source role: cardiology/PCP history</w:t>
+              <w:t>Custom Made; supplementary provenance; source role: cardiology/PCP history</w:t>
             </w:r>
           </w:p>
         </w:tc>
@@ -14118,7 +14118,7 @@
                 <w:b w:val="0"/>
                 <w:sz w:val="16"/>
               </w:rPr>
-              <w:t>Writer-produced supplementary provenance; source role: PCP/sleep history</w:t>
+              <w:t>Custom Made; supplementary provenance; source role: PCP/sleep history</w:t>
             </w:r>
           </w:p>
         </w:tc>
@@ -14249,7 +14249,7 @@
                 <w:b w:val="0"/>
                 <w:sz w:val="16"/>
               </w:rPr>
-              <w:t>Writer-produced supplementary administrative file; source role: Case Management/Social Work</w:t>
+              <w:t>Custom Made; supplementary administrative file; source role: Case Management/Social Work</w:t>
             </w:r>
           </w:p>
         </w:tc>
@@ -14380,7 +14380,7 @@
                 <w:b w:val="0"/>
                 <w:sz w:val="16"/>
               </w:rPr>
-              <w:t>Writer-produced supplementary chart snapshot; source role: problem list/past history</w:t>
+              <w:t>Custom Made; supplementary chart snapshot; source role: problem list/past history</w:t>
             </w:r>
           </w:p>
         </w:tc>

</xml_diff>